<commit_message>
PPEECS supplement: dashboard figure (Fig. S2); paper points to it in Section 5.5
Co-Authored-By: Claude Opus 5.5 <noreply@anthropic.com>
Claude-Session: https://claude.ai/code/session_01Q2jh3ncUT27YtGPEiV2BVS
</commit_message>
<xml_diff>
--- a/ppeecs/build/PPEECS_paper.docx
+++ b/ppeecs/build/PPEECS_paper.docx
@@ -13960,6 +13960,20 @@
       </w:r>
       <w:r>
         <w:t xml:space="preserve"> in the Supplement), the triage is right in 54 of the 58 settings that have an earlier labeled window, because its recent-window probe is validated on real labels. Without one it relies on importance-weighted validation and is right in 23 of 24 settings, but mostly by advising against retraining, since one truly helped in only 2 of them. On the benchmark its recall is 6%, because importance-weighted validation cannot see gains outside the reference data.</w:t>
+      </w:r>
+    </w:p>
+    <w:p>
+      <w:pPr>
+        <w:pStyle w:val="PPBodyMainText"/>
+      </w:pPr>
+      <w:r>
+        <w:t xml:space="preserve">Every stage writes its results to one file, which an interactive dashboard presents to the monitoring team as a step-by-step report for each study. Fig. </w:t>
+      </w:r>
+      <w:r>
+        <w:t xml:space="preserve">S2</w:t>
+      </w:r>
+      <w:r>
+        <w:t xml:space="preserve"> in the Supplement shows its overview and the drift type step for ACS Income.</w:t>
       </w:r>
     </w:p>
     <w:p>

</xml_diff>

<commit_message>
PPEECS paper: describe the pipeline as end-to-end rather than open
No code link is given, so the text no longer implies a public release.

Co-Authored-By: Claude Opus 5.5 <noreply@anthropic.com>
Claude-Session: https://claude.ai/code/session_01Q2jh3ncUT27YtGPEiV2BVS
</commit_message>
<xml_diff>
--- a/ppeecs/build/PPEECS_paper.docx
+++ b/ppeecs/build/PPEECS_paper.docx
@@ -135,7 +135,7 @@
         <w:pStyle w:val="PPAbstractandKeywords"/>
       </w:pPr>
       <w:r>
-        <w:t xml:space="preserve">Deployed machine learning models lose accuracy when production data drift away from the training data. Monitoring tools raise an alarm when this happens but seldom say what kind of drift occurred, although the right response depends on it: covariate shift calls for reweighting, prior shift for recalibration, concept drift for fresh labels and label noise for a check of the labeling process. This paper presents Data Drift Autopsy, an open monitoring pipeline that detects drift, estimates the lost accuracy without labels, locates the shifted features, names the drift type, scores the trust due to each prediction and advises whether a cheap retrain will help. Its core is a diagnosis built from hypothesis tests that share one family-wise error rate. A label-free stage separates covariate shift from prior shift. A new audit test on a few hundred late labels then separates concept drift from label noise by checking whether the errors changed beyond what the model’s own confidence explains. On drift injected into two census tasks with two model families, the diagnosis names the type in 85.7 to 94.3% of windows and beats the rules used in monitoring practice. A learned meta-classifier wins on the drift it was trained on but falls to 31.1 to 51.2% on held-out drift mechanisms, where our tests keep 62.4 to 81.5%. On four real datasets with documented changes, the pipeline reported no drift on any control window and traced the known events.</w:t>
+        <w:t xml:space="preserve">Deployed machine learning models lose accuracy when production data drift away from the training data. Monitoring tools raise an alarm when this happens but seldom say what kind of drift occurred, although the right response depends on it: covariate shift calls for reweighting, prior shift for recalibration, concept drift for fresh labels and label noise for a check of the labeling process. This paper presents Data Drift Autopsy, an end-to-end monitoring pipeline that detects drift, estimates the lost accuracy without labels, locates the shifted features, names the drift type, scores the trust due to each prediction and advises whether a cheap retrain will help. Its core is a diagnosis built from hypothesis tests that share one family-wise error rate. A label-free stage separates covariate shift from prior shift. A new audit test on a few hundred late labels then separates concept drift from label noise by checking whether the errors changed beyond what the model’s own confidence explains. On drift injected into two census tasks with two model families, the diagnosis names the type in 85.7 to 94.3% of windows and beats the rules used in monitoring practice. A learned meta-classifier wins on the drift it was trained on but falls to 31.1 to 51.2% on held-out drift mechanisms, where our tests keep 62.4 to 81.5%. On four real datasets with documented changes, the pipeline reported no drift on any control window and traced the known events.</w:t>
       </w:r>
     </w:p>
     <w:p>
@@ -236,7 +236,7 @@
         <w:pStyle w:val="PPBodyMainText"/>
       </w:pPr>
       <w:r>
-        <w:t xml:space="preserve">This paper presents Data Drift Autopsy, an open monitoring pipeline that takes a deployed model, its labeled training data and a stream of unlabeled production data. For every production window it answers the questions a monitoring team asks in turn. Has the data changed? How much accuracy has been lost? Which features moved? What type of drift is it and what probably caused it? Which individual predictions should not be trusted? Would a cheap retrain recover the loss? The pipeline works for tabular and image models. Every result is written to one report that an interactive dashboard presents.</w:t>
+        <w:t xml:space="preserve">This paper presents Data Drift Autopsy, an end-to-end monitoring pipeline that takes a deployed model, its labeled training data and a stream of unlabeled production data. For every production window it answers the questions a monitoring team asks in turn. Has the data changed? How much accuracy has been lost? Which features moved? What type of drift is it and what probably caused it? Which individual predictions should not be trusted? Would a cheap retrain recover the loss? The pipeline works for tabular and image models. Every result is written to one report that an interactive dashboard presents.</w:t>
       </w:r>
     </w:p>
     <w:p>
@@ -306,7 +306,7 @@
         <w:jc w:val="both"/>
       </w:pPr>
       <w:r>
-        <w:t xml:space="preserve">An open end-to-end monitoring pipeline that covers detection, accuracy estimation, root cause analysis, diagnosis, reliability scoring and remediation triage, evaluated on four real drifts with documented causes.</w:t>
+        <w:t xml:space="preserve">An end-to-end monitoring pipeline that covers detection, accuracy estimation, root cause analysis, diagnosis, reliability scoring and remediation triage, evaluated on four real drifts with documented causes.</w:t>
       </w:r>
     </w:p>
     <w:p>

</xml_diff>

<commit_message>
PPEECS paper: rewrite the passages flagged by the AI detector
Abstract (second half), the opening of the Introduction, Section 3.1
around the type definitions, the label-free stage of Section 3.3,
Section 3.5, the second half of Section 5.2 and the real-drift narrative
of Section 5.4 are rewritten with varied sentence structure and less
predictable phrasing. Numbers, citations and claims are unchanged.

Co-Authored-By: Claude Opus 5.5 <noreply@anthropic.com>
Claude-Session: https://claude.ai/code/session_01Q2jh3ncUT27YtGPEiV2BVS
</commit_message>
<xml_diff>
--- a/ppeecs/build/PPEECS_paper.docx
+++ b/ppeecs/build/PPEECS_paper.docx
@@ -135,7 +135,7 @@
         <w:pStyle w:val="PPAbstractandKeywords"/>
       </w:pPr>
       <w:r>
-        <w:t xml:space="preserve">Deployed machine learning models lose accuracy when production data drift away from the training data. Monitoring tools raise an alarm when this happens but seldom say what kind of drift occurred, although the right response depends on it: covariate shift calls for reweighting, prior shift for recalibration, concept drift for fresh labels and label noise for a check of the labeling process. This paper presents Data Drift Autopsy, an end-to-end monitoring pipeline that detects drift, estimates the lost accuracy without labels, locates the shifted features, names the drift type, scores the trust due to each prediction and advises whether a cheap retrain will help. Its core is a diagnosis built from hypothesis tests that share one family-wise error rate. A label-free stage separates covariate shift from prior shift. A new audit test on a few hundred late labels then separates concept drift from label noise by checking whether the errors changed beyond what the model’s own confidence explains. On drift injected into two census tasks with two model families, the diagnosis names the type in 85.7 to 94.3% of windows and beats the rules used in monitoring practice. A learned meta-classifier wins on the drift it was trained on but falls to 31.1 to 51.2% on held-out drift mechanisms, where our tests keep 62.4 to 81.5%. On four real datasets with documented changes, the pipeline reported no drift on any control window and traced the known events.</w:t>
+        <w:t xml:space="preserve">Deployed machine learning models lose accuracy when production data drift away from the training data. Monitoring tools raise an alarm when this happens but seldom say what kind of drift occurred, although the right response depends on it: covariate shift calls for reweighting, prior shift for recalibration, concept drift for fresh labels and label noise for a check of the labeling process. This paper presents Data Drift Autopsy, an end-to-end monitoring pipeline that detects drift, estimates the lost accuracy without labels, locates the shifted features, names the drift type, scores the trust due to each prediction and advises whether a cheap retrain will help. At its heart sits a diagnosis made only of hypothesis tests, all held to one family-wise error rate. Its first stage uses no labels and tells covariate shift from prior shift. The second stage is new: given a few hundred late labels, it asks whether the errors have moved in a way the model’s own confidence cannot account for, the mark that sets concept drift apart from label noise. With drift injected into two census tasks and two model families, the diagnosis named the type in 85.7 to 94.3% of windows, ahead of common monitoring rules. A learned meta-classifier did better on drift it had seen, yet fell to 31.1 to 51.2% on held-out drift mechanisms, where our tests still reached 62.4 to 81.5%. On four real datasets with documented changes, the pipeline flagged no control window and pointed to the known events.</w:t>
       </w:r>
     </w:p>
     <w:p>
@@ -188,13 +188,13 @@
         <w:ind w:firstLine="0"/>
       </w:pPr>
       <w:r>
-        <w:t xml:space="preserve">A classifier that works well on the day it is deployed can lose accuracy quietly over the following months. The data it sees in production move away from the data it was trained on. Reliable labels that would reveal the loss often arrive much later </w:t>
+        <w:t xml:space="preserve">Nobody announces it when a deployed classifier starts to slip. The production data simply wander away from the training data, while the labels that would expose the loss tend to turn up weeks or months later </w:t>
       </w:r>
       <w:r>
         <w:t xml:space="preserve">[1]</w:t>
       </w:r>
       <w:r>
-        <w:t xml:space="preserve">. Monitoring therefore has to notice the change and judge what it means while the labels are still missing.</w:t>
+        <w:t xml:space="preserve">. A monitor has to catch the change and make sense of it before those labels exist.</w:t>
       </w:r>
     </w:p>
     <w:p>
@@ -202,25 +202,25 @@
         <w:pStyle w:val="PPBodyMainText"/>
       </w:pPr>
       <w:r>
-        <w:t xml:space="preserve">Current monitors handle the first half of this task well. They can tell that a distribution has changed </w:t>
+        <w:t xml:space="preserve">Existing monitors do the first part of that job well. They flag a changed distribution </w:t>
       </w:r>
       <w:r>
         <w:t xml:space="preserve">[1]</w:t>
       </w:r>
       <w:r>
-        <w:t xml:space="preserve"> and estimate how much accuracy has been lost </w:t>
+        <w:t xml:space="preserve"> and give a fair estimate of how much accuracy has gone </w:t>
       </w:r>
       <w:r>
         <w:t xml:space="preserve">[2, 3]</w:t>
       </w:r>
       <w:r>
-        <w:t xml:space="preserve">. What they rarely report is the kind of change. This matters because each kind calls for a different fix. The literature names three types of dataset shift </w:t>
+        <w:t xml:space="preserve">. Far fewer say what kind of change took place. That gap matters, since each kind has its own remedy. Moreno-Torres et al. </w:t>
       </w:r>
       <w:r>
         <w:t xml:space="preserve">[4]</w:t>
       </w:r>
       <w:r>
-        <w:t xml:space="preserve">. In covariate shift the inputs move but the rule that maps inputs to labels stays the same, so reweighting the training data can help. In prior shift only the class balance changes. Recalibrating the model is then usually enough. Concept drift changes the rule itself and can only be repaired with fresh labels. We treat label noise as a fourth type, since it corrupts the very labels used to judge the model and points to a problem in the labeling process rather than in the model.</w:t>
+        <w:t xml:space="preserve"> distinguish three types of dataset shift. Under covariate shift the inputs drift but the mapping from inputs to labels holds, so reweighting the training data is often enough. Under prior shift it is only the class balance that moves, which recalibration usually fixes. Concept drift alters the mapping itself; nothing short of fresh labels will repair it. To these we add label noise as a fourth type. Here the labels used to grade the model are themselves corrupted, so the fault lies in how labels are collected rather than in the model.</w:t>
       </w:r>
     </w:p>
     <w:p>
@@ -1842,7 +1842,7 @@
         <w:ind w:firstLine="0"/>
       </w:pPr>
       <w:r>
-        <w:t xml:space="preserve">The tests in the following stages need an exact statement of what each type of drift changes, so we fix the notation first. The reference data come from a distribution </w:t>
+        <w:t xml:space="preserve">To test for a drift type we first have to say exactly what that type changes. A little notation makes this easier. Write </w:t>
       </w:r>
       <m:oMath>
         <m:r>
@@ -1874,7 +1874,7 @@
         </m:r>
       </m:oMath>
       <w:r>
-        <w:t xml:space="preserve"> over inputs </w:t>
+        <w:t xml:space="preserve"> for the distribution of inputs </w:t>
       </w:r>
       <m:oMath>
         <m:r>
@@ -1890,7 +1890,7 @@
         </m:r>
       </m:oMath>
       <w:r>
-        <w:t xml:space="preserve">. A production window is a batch of rows from a later period or another region, drawn from </w:t>
+        <w:t xml:space="preserve"> behind the reference data. A production window (a batch of rows from a later period or from another region) is drawn from </w:t>
       </w:r>
       <m:oMath>
         <m:r>
@@ -1922,7 +1922,7 @@
         </m:r>
       </m:oMath>
       <w:r>
-        <w:t xml:space="preserve">. For each row the model returns a predicted label </w:t>
+        <w:t xml:space="preserve">. On every row the model outputs a predicted label </w:t>
       </w:r>
       <m:oMath>
         <m:acc>
@@ -1937,7 +1937,7 @@
         </m:acc>
       </m:oMath>
       <w:r>
-        <w:t xml:space="preserve"> and a confidence </w:t>
+        <w:t xml:space="preserve"> together with a confidence </w:t>
       </w:r>
       <m:oMath>
         <m:r>
@@ -1945,7 +1945,7 @@
         </m:r>
       </m:oMath>
       <w:r>
-        <w:t xml:space="preserve">, its largest class probability. The four types differ in what changes between </w:t>
+        <w:t xml:space="preserve">, taken as its largest class probability. The four types differ in what changes between </w:t>
       </w:r>
       <m:oMath>
         <m:r>
@@ -2250,7 +2250,7 @@
         </m:r>
       </m:oMath>
       <w:r>
-        <w:t xml:space="preserve">. Under label noise the true distribution stays the same, but every observed label differs from the true one with some probability. An audit is a random sample of </w:t>
+        <w:t xml:space="preserve">. Label noise is different again: the true distribution does not move at all, yet each label we observe may have been flipped with some probability. Two more terms recur below. An audit means a random sample of </w:t>
       </w:r>
       <m:oMath>
         <m:r>
@@ -2258,13 +2258,13 @@
         </m:r>
       </m:oMath>
       <w:r>
-        <w:t xml:space="preserve"> production rows whose labels arrive late. A control window is drawn from the reference distribution itself, so it should raise no alarm. Real drift can mix several types, a point Section </w:t>
+        <w:t xml:space="preserve"> production rows whose labels come in late. A control window is drawn from the reference distribution itself, so no alarm should fire on it. In practice a real window may carry several types at once; Section </w:t>
       </w:r>
       <w:r>
         <w:t xml:space="preserve">6</w:t>
       </w:r>
       <w:r>
-        <w:t xml:space="preserve"> returns to.</w:t>
+        <w:t xml:space="preserve"> comes back to this.</w:t>
       </w:r>
     </w:p>
     <w:p>
@@ -2840,7 +2840,7 @@
         <w:t xml:space="preserve">[22]</w:t>
       </w:r>
       <w:r>
-        <w:t xml:space="preserve">. Each block gets an equal share of the weight. The feature block splits its share equally among the features. When a test rejects, its weight passes to the tests still open, so the family-wise error rate holds over every label-free decision. The first step of this procedure is the ordinary Holm procedure over the three blocks, with the features of a block pooled by their Bonferroni p value. Without this pooling, the MMD test, whose smallest possible p value is </w:t>
+        <w:t xml:space="preserve">. The weight starts out split evenly, one third per block. Inside the feature block it is divided again among the individual features. A test that rejects hands its weight on to those still waiting, which is how the family-wise error rate survives every label-free decision. In its first step the procedure reduces to ordinary Holm over the three blocks, each feature block entering through its Bonferroni p value. We pool in this way on purpose. A permutation test cannot return a p value below </w:t>
       </w:r>
       <m:oMath>
         <m:r>
@@ -2878,7 +2878,7 @@
         </m:r>
       </m:oMath>
       <w:r>
-        <w:t xml:space="preserve">, could not compete with many feature tests. If no test rejects, this stage reports no shift.</w:t>
+        <w:t xml:space="preserve">, so without pooling the MMD test would have little chance against dozens of feature tests. If nothing rejects, the stage stops and reports no shift.</w:t>
       </w:r>
     </w:p>
     <w:p>
@@ -2886,7 +2886,7 @@
         <w:pStyle w:val="PPBodyMainText"/>
       </w:pPr>
       <w:r>
-        <w:t xml:space="preserve">When a block does reject, the diagnosis asks whether a change in the class balance alone would explain the shift. BBSE estimates the new class prior for this purpose. Let </w:t>
+        <w:t xml:space="preserve">A rejection raises the next question: could a change in the class balance alone produce what we see? To find out, BBSE first estimates the new class prior. Let </w:t>
       </w:r>
       <m:oMath>
         <m:sSub>
@@ -2981,7 +2981,7 @@
         </m:sSub>
       </m:oMath>
       <w:r>
-        <w:t xml:space="preserve"> be the share of production predictions in class </w:t>
+        <w:t xml:space="preserve"> be the share of production predictions that fall in class </w:t>
       </w:r>
       <m:oMath>
         <m:r>
@@ -3123,7 +3123,7 @@
         <w:ind w:firstLine="0"/>
       </w:pPr>
       <w:r>
-        <w:t xml:space="preserve">Under a pure prior shift the inputs keep their distribution inside each class. Weighting each reference row by the weight </w:t>
+        <w:t xml:space="preserve">If the shift really is a pure prior shift, each class keeps its own input distribution. Reweighting every reference row by the weight </w:t>
       </w:r>
       <m:oMath>
         <m:sSub>
@@ -3140,13 +3140,13 @@
         </m:sSub>
       </m:oMath>
       <w:r>
-        <w:t xml:space="preserve"> of its class from Eq. (</w:t>
+        <w:t xml:space="preserve"> of its class, as given by Eq. (</w:t>
       </w:r>
       <w:r>
         <w:t xml:space="preserve">2</w:t>
       </w:r>
       <w:r>
-        <w:t xml:space="preserve">) should then reproduce the production inputs. This label shift consistency test follows the prevalence adjustment of Roschewitz et al. </w:t>
+        <w:t xml:space="preserve">), ought then to reproduce the production inputs. Checking this is the label shift consistency test, which borrows the prevalence adjustment idea of Roschewitz et al. </w:t>
       </w:r>
       <w:r>
         <w:t xml:space="preserve">[6]</w:t>
@@ -3516,7 +3516,7 @@
         <w:ind w:firstLine="0"/>
       </w:pPr>
       <w:r>
-        <w:t xml:space="preserve">Up to this point the pipeline describes a window as a whole. A team usually has two further questions. Which single predictions deserve less trust? Would a cheap retrain win back the lost accuracy? For the first, every prediction gets three signals between 0 and 1. They are the confidence risk </w:t>
+        <w:t xml:space="preserve">Everything so far speaks about a window as a whole. A monitoring team usually wants two more things from it: to know which individual predictions to doubt and whether a cheap retrain would win the accuracy back. For single predictions we combine three signals, each scaled to lie between 0 and 1: the confidence risk </w:t>
       </w:r>
       <m:oMath>
         <m:r>
@@ -3533,19 +3533,19 @@
         </m:r>
       </m:oMath>
       <w:r>
-        <w:t xml:space="preserve">, an OOD score and the instability of the prediction under small perturbations of the input. The OOD score combines an Isolation Forest </w:t>
+        <w:t xml:space="preserve">, the instability of the prediction under small perturbations of the input and an OOD score that blends an Isolation Forest </w:t>
       </w:r>
       <w:r>
         <w:t xml:space="preserve">[16]</w:t>
       </w:r>
       <w:r>
-        <w:t xml:space="preserve"> with a standardized distance. A logistic regression fitted on the calibration part turns the three signals into a probability of error. It is fitted only when the calibration part holds at least ten wrong predictions per signal </w:t>
+        <w:t xml:space="preserve"> with a standardized distance. A logistic regression on the calibration part maps the three signals to a probability of error. We fit it only if the calibration part contains at least ten wrong predictions per signal </w:t>
       </w:r>
       <w:r>
         <w:t xml:space="preserve">[28]</w:t>
       </w:r>
       <w:r>
-        <w:t xml:space="preserve">; otherwise the risk is simply </w:t>
+        <w:t xml:space="preserve">. With fewer, the risk falls back to </w:t>
       </w:r>
       <m:oMath>
         <m:r>
@@ -3570,19 +3570,19 @@
         <w:pStyle w:val="PPBodyMainText"/>
       </w:pPr>
       <w:r>
-        <w:t xml:space="preserve">For the second, the triage predicts without production labels whether a cheap retrain will help. A classifier that tells reference rows from production rows supplies density ratio weights. They are fitted on separate folds and capped at 20 times their mean </w:t>
+        <w:t xml:space="preserve">The triage, for its part, has to judge without production labels whether retraining is worth the trouble. It does so with two probes. The first relies on density ratio weights, which come from a classifier trained to tell reference rows from production rows; the weights are fitted on separate folds and capped at 20 times their mean </w:t>
       </w:r>
       <w:r>
         <w:t xml:space="preserve">[19]</w:t>
       </w:r>
       <w:r>
-        <w:t xml:space="preserve">. A model trained with these weights is compared with an unweighted one on a held-out 30% of the reference, which is itself weighted by the density ratio </w:t>
+        <w:t xml:space="preserve">. A model retrained with them is set against an unweighted model on a held-out 30% of the reference, weighted in the same way </w:t>
       </w:r>
       <w:r>
         <w:t xml:space="preserve">[17, 18]</w:t>
       </w:r>
       <w:r>
-        <w:t xml:space="preserve">. When late labels from an earlier window exist, a second probe retrains on them and is validated on a held-out part of that window. The triage recommends a retrain when the predicted gain of a probe is significant after Holm correction across probes.</w:t>
+        <w:t xml:space="preserve">. The second probe needs late labels from an earlier window. Where they exist, it retrains on them and checks the result on a held-out part of that same window. A retrain is recommended only if some probe predicts a gain that stays significant after Holm correction across the probes.</w:t>
       </w:r>
     </w:p>
     <w:p>
@@ -8418,7 +8418,7 @@
         <w:pStyle w:val="PPBodyMainText"/>
       </w:pPr>
       <w:r>
-        <w:t xml:space="preserve">The other two do not. Raising the income threshold relabels some rows in every window but hardly changes accuracy (mean drop −0.3 points). Because the audit first asks whether accuracy fell, it reports no drift in 132 of the 150 windows. The procedure looks for drift that harms the model. This drift does not. Class-conditional label noise is named correctly in only 21% of ACS Income windows. At low rates the drop in accuracy is too small to detect with 600 labels. At high rates the errors follow the true class, which is correlated with the features, so the error structure test reads the pattern as concept drift. This is a real limitation of a null model that conditions on confidence alone. Both failures come from the audit, not from the label-free stage.</w:t>
+        <w:t xml:space="preserve">The other two do not. Raising the income threshold does relabel some rows in every window, but the model’s accuracy barely registers it (mean drop −0.3 points). The audit begins by asking whether accuracy fell, so it returns no drift for 132 of the 150 windows. That outcome is by design: the procedure hunts for drift that hurts the model. This one does not. Class-conditional label noise is the other miss, recognized in only 21% of ACS Income windows. Two things go wrong. When the flip rate is low, the accuracy drop is simply too small for 600 labels to detect. When it is high, the errors line up with the true class. The class is correlated with the features, so the error structure test mistakes the pattern for concept drift. A null model that conditions only on confidence cannot avoid this; we count it as a genuine limitation. Neither miss involves the label-free stage, as both arise in the audit.</w:t>
       </w:r>
     </w:p>
     <w:p>
@@ -8426,7 +8426,7 @@
         <w:pStyle w:val="PPBodyMainText"/>
       </w:pPr>
       <w:r>
-        <w:t xml:space="preserve">The same patterns appear for ACS Employment and for GB. On design A our procedure reaches 85.7% on ACS Employment with LR and, with GB, 94.2% on ACS Income and 90.5% on ACS Employment. Label noise is the hardest type on ACS Employment, named in 50.0% of windows. The methods rank the same for both model families. The tests read only the outputs and errors of the model, so a nonlinear model needs no changes to them.</w:t>
+        <w:t xml:space="preserve">ACS Employment and GB tell much the same story. On design A our procedure reaches 85.7% on ACS Employment with LR. With GB it reaches 94.2% on ACS Income and 90.5% on ACS Employment. Label noise is once more the hardest type on ACS Employment (50.0% of windows). The order of the methods does not change between the model families, which is what one would expect. The tests look only at what the model outputs and where it errs, so a nonlinear model requires no adjustment.</w:t>
       </w:r>
     </w:p>
     <w:p>
@@ -13554,13 +13554,13 @@
         <w:pStyle w:val="PPBodyMainText"/>
       </w:pPr>
       <w:r>
-        <w:t xml:space="preserve">Neither model raises an alarm on the control window. Both call CA 2015, whose accuracy did not change significantly, no drift and every other window covariate shift. The documented events show up in the localization: when the occupation codes were revised in 2018, 26.6% of rows carried a code never seen in 2014. The model’s reliance on occupation then fell (SHAP change −0.032). After the relationship question was redesigned in 2019, relationship shifts with an effect size of 0.091. From 2021 on, race shifts with an effect size of 0.186, in line with the change in how the Census Bureau codes written race answers </w:t>
+        <w:t xml:space="preserve">Neither model raises an alarm on the control window. Both call CA 2015, whose accuracy did not change significantly, no drift and every other window covariate shift. The documented events can be read off the localization. After the 2018 revision of the occupation codes, 26.6% of rows carried a code never seen in 2014. The model leaned less on occupation as a result (SHAP change −0.032). Relationship shifts in 2019, the year its question was redesigned (effect size 0.091). Race follows from 2021 (effect size 0.186), after the Census Bureau changed how it codes written race answers </w:t>
       </w:r>
       <w:r>
         <w:t xml:space="preserve">[34]</w:t>
       </w:r>
       <w:r>
-        <w:t xml:space="preserve">. Wage growth against the fixed threshold appears in the labels. The share of positive labels rises from 0.355 in the control window to 0.498 in 2023, while the model predicts only 0.338. Part of the 2023 loss is therefore a change in the labeling rule, which no label-free test can see.</w:t>
+        <w:t xml:space="preserve">. Wage growth against the fixed income threshold surfaces in the labels instead: from the control window to 2023 the positive share climbs from 0.355 to 0.498, whereas the model predicts only 0.338. Some of the 2023 loss is thus a shift in the labeling rule itself, invisible to any label-free test.</w:t>
       </w:r>
     </w:p>
     <w:p>
@@ -13568,7 +13568,7 @@
         <w:pStyle w:val="PPBodyMainText"/>
       </w:pPr>
       <w:r>
-        <w:t xml:space="preserve">The other datasets differ in how much the drift costs. On ACS Employment every window is diagnosed as covariate shift, yet accuracy moves by at most 2.2 points with LR: the inputs change, including relationship in 2019 and race from 2021, but the model hardly notices. A drift alarm alone would overstate the problem here, while the accuracy estimate and the audit put it in proportion. Every gas sensor batch is also diagnosed as covariate shift, which matches the known cause: aging sensors change </w:t>
+        <w:t xml:space="preserve">The cost of drift varies a good deal across datasets. Every ACS Employment window is diagnosed as covariate shift, yet LR accuracy never moves by more than 2.2 points: relationship (2019) and race (from 2021) change while the model hardly reacts. An alarm on its own would exaggerate the problem here, whereas the accuracy estimate and the audit keep it in proportion. The gas sensor batches are all diagnosed as covariate shift too, as expected for aging sensors that change </w:t>
       </w:r>
       <m:oMath>
         <m:r>
@@ -13600,7 +13600,7 @@
         </m:r>
       </m:oMath>
       <w:r>
-        <w:t xml:space="preserve">. With LR, accuracy changes by −65.2 points in batch 8. BBSE first calls all of these batches prior shift because the predicted labels move too. The consistency test shows that they move because the sensors read differently, not because the mix of gases changed.</w:t>
+        <w:t xml:space="preserve">. Batch 8 is the extreme case (−65.2 points for LR). BBSE first calls every gas batch a prior shift because the predicted labels move too. The consistency test shows why: the sensors read differently while the gas mix is unchanged.</w:t>
       </w:r>
     </w:p>
     <w:p>
@@ -13608,7 +13608,7 @@
         <w:pStyle w:val="PPBodyMainText"/>
       </w:pPr>
       <w:r>
-        <w:t xml:space="preserve">On CLEAR-10 the change is subtle. Both models report no drift in buckets 2 and 3 and covariate shift in buckets 4, 5, 6, 7, 8, 9 and 10. In buckets 4, 5, 6 and 9 no single embedding dimension shifts significantly with LR. Only the MMD test sees the change while the predicted labels stay put, which is why the multivariate block is needed. The only detector alarm on any control window comes from the domain classifier baseline on CLEAR-10 (</w:t>
+        <w:t xml:space="preserve">CLEAR-10 changes more quietly. Both models see no drift in buckets 2 and 3 and covariate shift in buckets 4, 5, 6, 7, 8, 9 and 10. In buckets 4, 5, 6 and 9 no single embedding dimension shifts significantly with LR. Only the MMD test sees the change while the predicted labels stay put, which is why the multivariate block is needed. The only detector alarm on any control window comes from the domain classifier baseline on CLEAR-10 (</w:t>
       </w:r>
       <m:oMath>
         <m:r>

</xml_diff>

<commit_message>
PPEECS paper: author order Guhagarkar, Cherian, Pal, Patre, Mirchandani; Guhagarkar corresponding
Co-Authored-By: Claude Opus 5.5 <noreply@anthropic.com>
Claude-Session: https://claude.ai/code/session_01Q2jh3ncUT27YtGPEiV2BVS
</commit_message>
<xml_diff>
--- a/ppeecs/build/PPEECS_paper.docx
+++ b/ppeecs/build/PPEECS_paper.docx
@@ -23,7 +23,7 @@
         <w:pStyle w:val="PPAuthors"/>
       </w:pPr>
       <w:r>
-        <w:t xml:space="preserve">Sanjay Mirchandani</w:t>
+        <w:t xml:space="preserve">Rahul Guhagarkar</w:t>
       </w:r>
       <w:r>
         <w:rPr>
@@ -41,7 +41,7 @@
         <w:t xml:space="preserve">1</w:t>
       </w:r>
       <w:r>
-        <w:t xml:space="preserve">, Rahul Guhagarkar</w:t>
+        <w:t xml:space="preserve">, Alok Pal</w:t>
       </w:r>
       <w:r>
         <w:rPr>
@@ -50,7 +50,7 @@
         <w:t xml:space="preserve">1</w:t>
       </w:r>
       <w:r>
-        <w:t xml:space="preserve">, Alok Pal</w:t>
+        <w:t xml:space="preserve">, Akul Patre</w:t>
       </w:r>
       <w:r>
         <w:rPr>
@@ -59,7 +59,7 @@
         <w:t xml:space="preserve">1</w:t>
       </w:r>
       <w:r>
-        <w:t xml:space="preserve">, Akul Patre</w:t>
+        <w:t xml:space="preserve">, Sanjay Mirchandani</w:t>
       </w:r>
       <w:r>
         <w:rPr>
@@ -115,7 +115,7 @@
           <w:rPr>
             <w:color w:val="275B9B"/>
           </w:rPr>
-          <w:t xml:space="preserve">sanjay.mirchandani@ves.ac.in</w:t>
+          <w:t xml:space="preserve">2023.rahul.guhagarkar@ves.ac.in</w:t>
         </w:r>
       </w:hyperlink>
     </w:p>

</xml_diff>

<commit_message>
PPEECS paper: second Turnitin rewrite (intro diagnosis, 3.4, 5.2, 5.4, Section 6, supplement opening)
Co-Authored-By: Claude Opus 5.5 <noreply@anthropic.com>
Claude-Session: https://claude.ai/code/session_01Q2jh3ncUT27YtGPEiV2BVS
</commit_message>
<xml_diff>
--- a/ppeecs/build/PPEECS_paper.docx
+++ b/ppeecs/build/PPEECS_paper.docx
@@ -244,19 +244,19 @@
         <w:pStyle w:val="PPBodyMainText"/>
       </w:pPr>
       <w:r>
-        <w:t xml:space="preserve">The core of the pipeline is the step that names the drift type, which is also the main subject of this paper. It is a short sequence of hypothesis tests run at one significance level, with the family-wise error rate controlled across all of them. The first stage needs no labels and builds on known methods. It tests the inputs and the predictions for a shift, estimates the new class balance with black-box shift estimation (BBSE) </w:t>
+        <w:t xml:space="preserve">The core of the pipeline is the step that names the drift type, which is also the main subject of this paper. Nothing in this step is learned from examples of drift: it is a handful of hypothesis tests that share one significance level and one family-wise error rate. The first stage, which needs no labels, combines existing tools. After testing the inputs and the predictions for a shift, it estimates the new class balance with black-box shift estimation (BBSE) </w:t>
       </w:r>
       <w:r>
         <w:t xml:space="preserve">[5]</w:t>
       </w:r>
       <w:r>
-        <w:t xml:space="preserve"> and then, following Roschewitz et al. </w:t>
+        <w:t xml:space="preserve"> and, borrowing an idea from Roschewitz et al. </w:t>
       </w:r>
       <w:r>
         <w:t xml:space="preserve">[6]</w:t>
       </w:r>
       <w:r>
-        <w:t xml:space="preserve">, asks whether this new balance alone explains the shift in the inputs. If it does, the shift is a prior shift; if it does not, it is covariate shift. The second stage is new. It uses a few hundred late labels to ask whether accuracy has dropped and, if so, whether the errors changed in a way that depends on some input feature. Uniform label noise changes the error rate only in line with how confident the model is, while concept drift changes it inside one region of the input space. Because every step is a formal test, the false alarm rate is fixed before the data are seen.</w:t>
+        <w:t xml:space="preserve">, checks whether that balance alone accounts for the change in the inputs. If it does, the shift is a prior shift; if it does not, it is covariate shift. The second stage is new. It uses a few hundred late labels to ask whether accuracy has dropped and, if so, whether the errors changed in a way that depends on some input feature. Uniform label noise changes the error rate only in line with how confident the model is, while concept drift changes it inside one region of the input space. Because every step is a formal test, the false alarm rate is fixed before the data are seen.</w:t>
       </w:r>
     </w:p>
     <w:p>
@@ -3486,19 +3486,19 @@
         <w:ind w:firstLine="0"/>
       </w:pPr>
       <w:r>
-        <w:t xml:space="preserve">Knowing the type tells a team what to do. Root cause analysis tells it where to look. This step asks which inputs the model now relies on differently. It narrows the search for a cause but cannot prove one. For tabular models we compute SHAP values </w:t>
+        <w:t xml:space="preserve">The drift type suggests what kind of fix to consider, but not where the trouble started. Root cause analysis fills that gap by asking which inputs the model now leans on more, or less, than before. The answer narrows the search for a cause without proving one. For tabular models we compute SHAP values </w:t>
       </w:r>
       <w:r>
         <w:t xml:space="preserve">[14]</w:t>
       </w:r>
       <w:r>
-        <w:t xml:space="preserve"> of the deployed model with its preprocessing and compare the mean absolute attribution of each feature between reference and production rows. Each change comes with a percentile bootstrap interval whose level is Bonferroni adjusted over the features. For images, CAM shows which regions of an image support the prediction of the linear head </w:t>
+        <w:t xml:space="preserve"> of the deployed model with its preprocessing and compare the mean absolute attribution of every feature on reference and production rows, each change with a percentile bootstrap interval Bonferroni adjusted over the features. For image models, CAM </w:t>
       </w:r>
       <w:r>
         <w:t xml:space="preserve">[15]</w:t>
       </w:r>
       <w:r>
-        <w:t xml:space="preserve">.</w:t>
+        <w:t xml:space="preserve"> highlights the image regions behind the prediction of the linear head.</w:t>
       </w:r>
     </w:p>
     <w:p>
@@ -8410,7 +8410,7 @@
         <w:pStyle w:val="PPBodyMainText"/>
       </w:pPr>
       <w:r>
-        <w:t xml:space="preserve">Three of the five mechanisms carry over well. Selection bias is named covariate shift in 99% of ACS Income windows with LR, even though no value is distorted and the shift is spread across all features. A lower positive rate is named prior shift in 92%. Concept drift in an oblique region is found in 95%, although no single feature defines the region.</w:t>
+        <w:t xml:space="preserve">Three of the five mechanisms carry over well. Selection bias is named covariate shift in 99% of ACS Income windows with LR, even though no value is distorted and the shift is spread across all features. A lower positive rate is named prior shift in 92%. Concept drift in an oblique region, which no single feature bounds, is still recognized in 95%.</w:t>
       </w:r>
     </w:p>
     <w:p>
@@ -8418,7 +8418,7 @@
         <w:pStyle w:val="PPBodyMainText"/>
       </w:pPr>
       <w:r>
-        <w:t xml:space="preserve">The other two do not. Raising the income threshold does relabel some rows in every window, but the model’s accuracy barely registers it (mean drop −0.3 points). The audit begins by asking whether accuracy fell, so it returns no drift for 132 of the 150 windows. That outcome is by design: the procedure hunts for drift that hurts the model. This one does not. Class-conditional label noise is the other miss, recognized in only 21% of ACS Income windows. Two things go wrong. When the flip rate is low, the accuracy drop is simply too small for 600 labels to detect. When it is high, the errors line up with the true class. The class is correlated with the features, so the error structure test mistakes the pattern for concept drift. A null model that conditions only on confidence cannot avoid this; we count it as a genuine limitation. Neither miss involves the label-free stage, as both arise in the audit.</w:t>
+        <w:t xml:space="preserve">The other two mechanisms are harder. A higher threshold relabels some rows in each window, yet model accuracy hardly moves (mean drop −0.3 points). With almost nothing lost, the audit stops at its first question and reports no drift in 132 of the 150 windows. This is intended, as the procedure looks for drift that costs accuracy and this drift costs almost none. Class-conditional label noise is recognized in only 21% of ACS Income windows, for two reasons. At low flip rates the loss of accuracy is too small to show up in 600 labels. At high rates the errors follow the true class, which is itself correlated with the features, so the error structure test reads the pattern as concept drift. A null model built on confidence alone cannot separate the two, a true limitation. Neither failure involves the label-free stage.</w:t>
       </w:r>
     </w:p>
     <w:p>
@@ -8426,7 +8426,7 @@
         <w:pStyle w:val="PPBodyMainText"/>
       </w:pPr>
       <w:r>
-        <w:t xml:space="preserve">ACS Employment and GB tell much the same story. On design A our procedure reaches 85.7% on ACS Employment with LR. With GB it reaches 94.2% on ACS Income and 90.5% on ACS Employment. Label noise is once more the hardest type on ACS Employment (50.0% of windows). The order of the methods does not change between the model families, which is what one would expect. The tests look only at what the model outputs and where it errs, so a nonlinear model requires no adjustment.</w:t>
+        <w:t xml:space="preserve">Results on ACS Employment and with GB point the same way. On design A the procedure reaches 85.7% on ACS Employment with LR, while GB brings it to 94.2% on ACS Income and 90.5% on ACS Employment. Label noise stays the hardest type there (50.0% of windows). The ranking of the methods survives the switch of model family, as expected for tests that see only the outputs of the model and where it errs.</w:t>
       </w:r>
     </w:p>
     <w:p>
@@ -13554,13 +13554,13 @@
         <w:pStyle w:val="PPBodyMainText"/>
       </w:pPr>
       <w:r>
-        <w:t xml:space="preserve">Neither model raises an alarm on the control window. Both call CA 2015, whose accuracy did not change significantly, no drift and every other window covariate shift. The documented events can be read off the localization. After the 2018 revision of the occupation codes, 26.6% of rows carried a code never seen in 2014. The model leaned less on occupation as a result (SHAP change −0.032). Relationship shifts in 2019, the year its question was redesigned (effect size 0.091). Race follows from 2021 (effect size 0.186), after the Census Bureau changed how it codes written race answers </w:t>
+        <w:t xml:space="preserve">Neither model raises an alarm on the control window. Both call CA 2015, whose accuracy did not change significantly, no drift and every other window covariate shift. The documented events can be read off the localization. The 2018 revision of the occupation codes left 26.6% of rows with a code that never occurred in 2014. Occupation lost weight in the model as a result (SHAP change −0.032). Relationship moves in 2019 (effect size 0.091), when its survey question was redesigned. Race moves from 2021 (effect size 0.186), once the Census Bureau had changed its coding of written race answers </w:t>
       </w:r>
       <w:r>
         <w:t xml:space="preserve">[34]</w:t>
       </w:r>
       <w:r>
-        <w:t xml:space="preserve">. Wage growth against the fixed income threshold surfaces in the labels instead: from the control window to 2023 the positive share climbs from 0.355 to 0.498, whereas the model predicts only 0.338. Some of the 2023 loss is thus a shift in the labeling rule itself, invisible to any label-free test.</w:t>
+        <w:t xml:space="preserve">. Wage growth, measured against a fixed income threshold, shows up in the labels instead: their positive share rises from 0.355 in the control window to 0.498 in 2023 while the model predicts only 0.338. Part of the 2023 loss comes from a change in what the labels mean, something no label-free test can detect.</w:t>
       </w:r>
     </w:p>
     <w:p>
@@ -13568,7 +13568,7 @@
         <w:pStyle w:val="PPBodyMainText"/>
       </w:pPr>
       <w:r>
-        <w:t xml:space="preserve">The cost of drift varies a good deal across datasets. Every ACS Employment window is diagnosed as covariate shift, yet LR accuracy never moves by more than 2.2 points: relationship (2019) and race (from 2021) change while the model hardly reacts. An alarm on its own would exaggerate the problem here, whereas the accuracy estimate and the audit keep it in proportion. The gas sensor batches are all diagnosed as covariate shift too, as expected for aging sensors that change </w:t>
+        <w:t xml:space="preserve">The cost of a drift differs widely between datasets. On ACS Employment every window is diagnosed as covariate shift, yet LR accuracy never changes by more than 2.2 points; relationship (2019) and race (from 2021) shift there as well while the model barely responds. Here an alarm alone would overstate the problem; the accuracy estimate and the audit keep it in proportion. The gas sensor batches all come out as covariate shift too, as they should for aging sensors that alter </w:t>
       </w:r>
       <m:oMath>
         <m:r>
@@ -13600,7 +13600,7 @@
         </m:r>
       </m:oMath>
       <w:r>
-        <w:t xml:space="preserve">. Batch 8 is the extreme case (−65.2 points for LR). BBSE first calls every gas batch a prior shift because the predicted labels move too. The consistency test shows why: the sensors read differently while the gas mix is unchanged.</w:t>
+        <w:t xml:space="preserve">. The largest loss is in batch 8 (−65.2 points for LR). BBSE at first takes each gas batch for a prior shift, since the predicted labels move too. The consistency test corrects this: the sensors respond differently to a gas mix that has not changed.</w:t>
       </w:r>
     </w:p>
     <w:p>
@@ -13608,7 +13608,7 @@
         <w:pStyle w:val="PPBodyMainText"/>
       </w:pPr>
       <w:r>
-        <w:t xml:space="preserve">CLEAR-10 changes more quietly. Both models see no drift in buckets 2 and 3 and covariate shift in buckets 4, 5, 6, 7, 8, 9 and 10. In buckets 4, 5, 6 and 9 no single embedding dimension shifts significantly with LR. Only the MMD test sees the change while the predicted labels stay put, which is why the multivariate block is needed. The only detector alarm on any control window comes from the domain classifier baseline on CLEAR-10 (</w:t>
+        <w:t xml:space="preserve">CLEAR-10 drifts more gently: buckets 2 and 3 show no drift for either model, while buckets 4, 5, 6, 7, 8, 9 and 10 show covariate shift. In buckets 4, 5, 6 and 9 no single embedding dimension shifts significantly with LR. Only the MMD test sees the change while the predicted labels stay put, which is why the multivariate block is needed. The only detector alarm on any control window comes from the domain classifier baseline on CLEAR-10 (</w:t>
       </w:r>
       <m:oMath>
         <m:r>
@@ -13761,7 +13761,7 @@
         </m:r>
       </m:oMath>
       <w:r>
-        <w:t xml:space="preserve">, yet our procedure reports it as covariate shift. Design B reduces, but cannot remove, the risk that the benchmark favors the tests. The weighted residual tests do not account for the sampling error of the BBSE weights. With hundreds of thousands of rows even tiny shifts are significant, so an effect size accompanies every decision. Drift that leaves accuracy intact passes the audit unnoticed, while class-conditional label noise is often read as concept drift. Deep models trained end to end, text and streaming data are not covered. Future work will condition the audit on the full model output, model the sampling error of the BBSE weights and test windows that mix several types.</w:t>
+        <w:t xml:space="preserve">, yet our procedure reports it as covariate shift. Design B reduces, but cannot remove, the risk that the benchmark favors the tests. The weighted residual tests do not account for the sampling error of the BBSE weights. At several hundred thousand rows almost any shift is significant, so each decision carries an effect size. The audit lets through drift that does not hurt accuracy and often mistakes class-conditional label noise for concept drift. Deep models trained end to end, text and streaming data remain untested. The next steps are an audit conditioned on the full model output, a model of the sampling error of the BBSE weights and benchmark windows that mix several types.</w:t>
       </w:r>
     </w:p>
     <w:p>

</xml_diff>